<commit_message>
docs: expand community vs paid limitations in report
</commit_message>
<xml_diff>
--- a/docs/OnlyOffice_Community_Solution_Report.docx
+++ b/docs/OnlyOffice_Community_Solution_Report.docx
@@ -1150,207 +1150,380 @@
           <w:spacing w:val="0"/>
           <w:color w:val="0E2140"/>
         </w:rPr>
-        <w:t xml:space="preserve">6. Implementation Highlights in This Project</w:t>
-      </w:r>
-    </w:p>
-    <w:p>
-      <w:pPr>
-        <w:ind w:left="720" w:first-line="-720"/>
-      </w:pPr>
-      <w:r>
-        <w:rPr>
-          <w:rFonts w:ascii="Arial" w:hAnsi="Arial" w:cs="Arial"/>
-          <w:sz w:val="24"/>
-          <w:sz-cs w:val="24"/>
-          <w:b/>
-        </w:rPr>
-        <w:t xml:space="preserve"/>
-        <w:tab/>
-        <w:t xml:space="preserve">•</w:t>
-        <w:tab/>
-        <w:t xml:space="preserve"/>
-      </w:r>
-      <w:r>
-        <w:rPr>
-          <w:rFonts w:ascii="Arial" w:hAnsi="Arial" w:cs="Arial"/>
-          <w:sz w:val="24"/>
-          <w:sz-cs w:val="24"/>
-          <w:b/>
-          <w:spacing w:val="0"/>
-        </w:rPr>
-        <w:t xml:space="preserve">Two runtime modes:</w:t>
-      </w:r>
-      <w:r>
-        <w:rPr>
-          <w:rFonts w:ascii="Arial" w:hAnsi="Arial" w:cs="Arial"/>
-          <w:sz w:val="24"/>
-          <w:sz-cs w:val="24"/>
-          <w:spacing w:val="0"/>
-        </w:rPr>
-        <w:t xml:space="preserve"/>
-      </w:r>
-    </w:p>
-    <w:p>
-      <w:pPr>
-        <w:ind w:left="1440" w:first-line="-1440"/>
-      </w:pPr>
-      <w:r>
-        <w:rPr>
-          <w:rFonts w:ascii="Arial" w:hAnsi="Arial" w:cs="Arial"/>
-          <w:sz w:val="24"/>
-          <w:sz-cs w:val="24"/>
-        </w:rPr>
-        <w:t xml:space="preserve"/>
-        <w:tab/>
-        <w:t xml:space="preserve">◦</w:t>
-        <w:tab/>
-        <w:t xml:space="preserve"/>
-      </w:r>
-      <w:r>
-        <w:rPr>
-          <w:rFonts w:ascii="Arial" w:hAnsi="Arial" w:cs="Arial"/>
-          <w:sz w:val="24"/>
-          <w:sz-cs w:val="24"/>
-          <w:spacing w:val="0"/>
-        </w:rPr>
-        <w:t xml:space="preserve">HTTP over IP + ports (default for simple LAN demonstration)</w:t>
-      </w:r>
-    </w:p>
-    <w:p>
-      <w:pPr>
-        <w:ind w:left="1440" w:first-line="-1440"/>
-      </w:pPr>
-      <w:r>
-        <w:rPr>
-          <w:rFonts w:ascii="Arial" w:hAnsi="Arial" w:cs="Arial"/>
-          <w:sz w:val="24"/>
-          <w:sz-cs w:val="24"/>
-        </w:rPr>
-        <w:t xml:space="preserve"/>
-        <w:tab/>
-        <w:t xml:space="preserve">◦</w:t>
-        <w:tab/>
-        <w:t xml:space="preserve"/>
-      </w:r>
-      <w:r>
-        <w:rPr>
-          <w:rFonts w:ascii="Arial" w:hAnsi="Arial" w:cs="Arial"/>
-          <w:sz w:val="24"/>
-          <w:sz-cs w:val="24"/>
-          <w:spacing w:val="0"/>
-        </w:rPr>
-        <w:t xml:space="preserve">HTTPS/domain mode (optional, with Caddy)</w:t>
-      </w:r>
-    </w:p>
-    <w:p>
-      <w:pPr>
-        <w:ind w:left="720" w:first-line="-720"/>
-      </w:pPr>
-      <w:r>
-        <w:rPr>
-          <w:rFonts w:ascii="Arial" w:hAnsi="Arial" w:cs="Arial"/>
-          <w:sz w:val="24"/>
-          <w:sz-cs w:val="24"/>
-          <w:b/>
-        </w:rPr>
-        <w:t xml:space="preserve"/>
-        <w:tab/>
-        <w:t xml:space="preserve">•</w:t>
-        <w:tab/>
-        <w:t xml:space="preserve"/>
-      </w:r>
-      <w:r>
-        <w:rPr>
-          <w:rFonts w:ascii="Arial" w:hAnsi="Arial" w:cs="Arial"/>
-          <w:sz w:val="24"/>
-          <w:sz-cs w:val="24"/>
-          <w:b/>
-          <w:spacing w:val="0"/>
-        </w:rPr>
-        <w:t xml:space="preserve">No-black-box configuration:</w:t>
-      </w:r>
-      <w:r>
-        <w:rPr>
-          <w:rFonts w:ascii="Arial" w:hAnsi="Arial" w:cs="Arial"/>
-          <w:sz w:val="24"/>
-          <w:sz-cs w:val="24"/>
-          <w:spacing w:val="0"/>
-        </w:rPr>
-        <w:t xml:space="preserve"> integration is scripted and reproducible, not manual container edits.</w:t>
-      </w:r>
-    </w:p>
-    <w:p>
-      <w:pPr>
-        <w:ind w:left="720" w:first-line="-720"/>
-      </w:pPr>
-      <w:r>
-        <w:rPr>
-          <w:rFonts w:ascii="Arial" w:hAnsi="Arial" w:cs="Arial"/>
-          <w:sz w:val="24"/>
-          <w:sz-cs w:val="24"/>
-          <w:b/>
-        </w:rPr>
-        <w:t xml:space="preserve"/>
-        <w:tab/>
-        <w:t xml:space="preserve">•</w:t>
-        <w:tab/>
-        <w:t xml:space="preserve"/>
-      </w:r>
-      <w:r>
-        <w:rPr>
-          <w:rFonts w:ascii="Arial" w:hAnsi="Arial" w:cs="Arial"/>
-          <w:sz w:val="24"/>
-          <w:sz-cs w:val="24"/>
-          <w:b/>
-          <w:spacing w:val="0"/>
-        </w:rPr>
-        <w:t xml:space="preserve">Robustness controls:</w:t>
-      </w:r>
-      <w:r>
-        <w:rPr>
-          <w:rFonts w:ascii="Arial" w:hAnsi="Arial" w:cs="Arial"/>
-          <w:sz w:val="24"/>
-          <w:sz-cs w:val="24"/>
-          <w:spacing w:val="0"/>
-        </w:rPr>
-        <w:t xml:space="preserve"> resource limits, log rotation, health checks.</w:t>
-      </w:r>
-    </w:p>
-    <w:p>
-      <w:pPr>
-        <w:ind w:left="720" w:first-line="-720"/>
-      </w:pPr>
-      <w:r>
-        <w:rPr>
-          <w:rFonts w:ascii="Arial" w:hAnsi="Arial" w:cs="Arial"/>
-          <w:sz w:val="24"/>
-          <w:sz-cs w:val="24"/>
-          <w:b/>
-        </w:rPr>
-        <w:t xml:space="preserve"/>
-        <w:tab/>
-        <w:t xml:space="preserve">•</w:t>
-        <w:tab/>
-        <w:t xml:space="preserve"/>
-      </w:r>
-      <w:r>
-        <w:rPr>
-          <w:rFonts w:ascii="Arial" w:hAnsi="Arial" w:cs="Arial"/>
-          <w:sz w:val="24"/>
-          <w:sz-cs w:val="24"/>
-          <w:b/>
-          <w:spacing w:val="0"/>
-        </w:rPr>
-        <w:t xml:space="preserve">Recovery controls:</w:t>
-      </w:r>
-      <w:r>
-        <w:rPr>
-          <w:rFonts w:ascii="Arial" w:hAnsi="Arial" w:cs="Arial"/>
-          <w:sz w:val="24"/>
-          <w:sz-cs w:val="24"/>
-          <w:spacing w:val="0"/>
-        </w:rPr>
-        <w:t xml:space="preserve"> backup and restore scripts included.</w:t>
+        <w:t xml:space="preserve">6. Explicit Community vs Paid Limits (Important for Review)</w:t>
+      </w:r>
+    </w:p>
+    <w:p>
+      <w:pPr>
+        <w:spacing w:after="240"/>
+      </w:pPr>
+      <w:r>
+        <w:rPr>
+          <w:rFonts w:ascii="Arial" w:hAnsi="Arial" w:cs="Arial"/>
+          <w:sz w:val="24"/>
+          <w:sz-cs w:val="24"/>
+          <w:spacing w:val="0"/>
+        </w:rPr>
+        <w:t xml:space="preserve">The following limits are the key reasons this solution is “closest practical free alternative” rather than full commercial parity:</w:t>
+      </w:r>
+    </w:p>
+    <w:p>
+      <w:pPr>
+        <w:ind w:left="720" w:first-line="-720"/>
+      </w:pPr>
+      <w:r>
+        <w:rPr>
+          <w:rFonts w:ascii="Arial" w:hAnsi="Arial" w:cs="Arial"/>
+          <w:sz w:val="24"/>
+          <w:sz-cs w:val="24"/>
+          <w:b/>
+        </w:rPr>
+        <w:t xml:space="preserve"/>
+        <w:tab/>
+        <w:t xml:space="preserve">1</w:t>
+        <w:tab/>
+        <w:t xml:space="preserve"/>
+      </w:r>
+      <w:r>
+        <w:rPr>
+          <w:rFonts w:ascii="Arial" w:hAnsi="Arial" w:cs="Arial"/>
+          <w:sz w:val="24"/>
+          <w:sz-cs w:val="24"/>
+          <w:b/>
+          <w:spacing w:val="0"/>
+        </w:rPr>
+        <w:t xml:space="preserve">Simultaneous editing connections:</w:t>
+      </w:r>
+      <w:r>
+        <w:rPr>
+          <w:rFonts w:ascii="Arial" w:hAnsi="Arial" w:cs="Arial"/>
+          <w:sz w:val="24"/>
+          <w:sz-cs w:val="24"/>
+          <w:spacing w:val="0"/>
+        </w:rPr>
+        <w:t xml:space="preserve"/>
+        <w:br/>
+        <w:t xml:space="preserve">Community is limited to </w:t>
+      </w:r>
+      <w:r>
+        <w:rPr>
+          <w:rFonts w:ascii="Arial" w:hAnsi="Arial" w:cs="Arial"/>
+          <w:sz w:val="24"/>
+          <w:sz-cs w:val="24"/>
+          <w:b/>
+          <w:spacing w:val="0"/>
+        </w:rPr>
+        <w:t xml:space="preserve">up to 20 simultaneous editing connections</w:t>
+      </w:r>
+      <w:r>
+        <w:rPr>
+          <w:rFonts w:ascii="Arial" w:hAnsi="Arial" w:cs="Arial"/>
+          <w:sz w:val="24"/>
+          <w:sz-cs w:val="24"/>
+          <w:spacing w:val="0"/>
+        </w:rPr>
+        <w:t xml:space="preserve">.</w:t>
+        <w:br/>
+        <w:t xml:space="preserve">One opened editor tab counts as one connection.</w:t>
+        <w:br/>
+        <w:t xml:space="preserve">After the limit is reached, additional documents open in </w:t>
+      </w:r>
+      <w:r>
+        <w:rPr>
+          <w:rFonts w:ascii="Arial" w:hAnsi="Arial" w:cs="Arial"/>
+          <w:sz w:val="24"/>
+          <w:sz-cs w:val="24"/>
+          <w:b/>
+          <w:spacing w:val="0"/>
+        </w:rPr>
+        <w:t xml:space="preserve">read-only mode</w:t>
+      </w:r>
+      <w:r>
+        <w:rPr>
+          <w:rFonts w:ascii="Arial" w:hAnsi="Arial" w:cs="Arial"/>
+          <w:sz w:val="24"/>
+          <w:sz-cs w:val="24"/>
+          <w:spacing w:val="0"/>
+        </w:rPr>
+        <w:t xml:space="preserve">.</w:t>
+      </w:r>
+    </w:p>
+    <w:p>
+      <w:pPr>
+        <w:ind w:left="720" w:first-line="-720"/>
+      </w:pPr>
+      <w:r>
+        <w:rPr>
+          <w:rFonts w:ascii="Arial" w:hAnsi="Arial" w:cs="Arial"/>
+          <w:sz w:val="24"/>
+          <w:sz-cs w:val="24"/>
+          <w:b/>
+        </w:rPr>
+        <w:t xml:space="preserve"/>
+        <w:tab/>
+        <w:t xml:space="preserve">2</w:t>
+        <w:tab/>
+        <w:t xml:space="preserve"/>
+      </w:r>
+      <w:r>
+        <w:rPr>
+          <w:rFonts w:ascii="Arial" w:hAnsi="Arial" w:cs="Arial"/>
+          <w:sz w:val="24"/>
+          <w:sz-cs w:val="24"/>
+          <w:b/>
+          <w:spacing w:val="0"/>
+        </w:rPr>
+        <w:t xml:space="preserve">Recommended user scale:</w:t>
+      </w:r>
+      <w:r>
+        <w:rPr>
+          <w:rFonts w:ascii="Arial" w:hAnsi="Arial" w:cs="Arial"/>
+          <w:sz w:val="24"/>
+          <w:sz-cs w:val="24"/>
+          <w:spacing w:val="0"/>
+        </w:rPr>
+        <w:t xml:space="preserve"/>
+        <w:br/>
+        <w:t xml:space="preserve">Community is listed as </w:t>
+      </w:r>
+      <w:r>
+        <w:rPr>
+          <w:rFonts w:ascii="Arial" w:hAnsi="Arial" w:cs="Arial"/>
+          <w:sz w:val="24"/>
+          <w:sz-cs w:val="24"/>
+          <w:b/>
+          <w:spacing w:val="0"/>
+        </w:rPr>
+        <w:t xml:space="preserve">up to 20 recommended users</w:t>
+      </w:r>
+      <w:r>
+        <w:rPr>
+          <w:rFonts w:ascii="Arial" w:hAnsi="Arial" w:cs="Arial"/>
+          <w:sz w:val="24"/>
+          <w:sz-cs w:val="24"/>
+          <w:spacing w:val="0"/>
+        </w:rPr>
+        <w:t xml:space="preserve">.</w:t>
+      </w:r>
+    </w:p>
+    <w:p>
+      <w:pPr>
+        <w:ind w:left="720" w:first-line="-720"/>
+      </w:pPr>
+      <w:r>
+        <w:rPr>
+          <w:rFonts w:ascii="Arial" w:hAnsi="Arial" w:cs="Arial"/>
+          <w:sz w:val="24"/>
+          <w:sz-cs w:val="24"/>
+          <w:b/>
+        </w:rPr>
+        <w:t xml:space="preserve"/>
+        <w:tab/>
+        <w:t xml:space="preserve">3</w:t>
+        <w:tab/>
+        <w:t xml:space="preserve"/>
+      </w:r>
+      <w:r>
+        <w:rPr>
+          <w:rFonts w:ascii="Arial" w:hAnsi="Arial" w:cs="Arial"/>
+          <w:sz w:val="24"/>
+          <w:sz-cs w:val="24"/>
+          <w:b/>
+          <w:spacing w:val="0"/>
+        </w:rPr>
+        <w:t xml:space="preserve">Support model:</w:t>
+      </w:r>
+      <w:r>
+        <w:rPr>
+          <w:rFonts w:ascii="Arial" w:hAnsi="Arial" w:cs="Arial"/>
+          <w:sz w:val="24"/>
+          <w:sz-cs w:val="24"/>
+          <w:spacing w:val="0"/>
+        </w:rPr>
+        <w:t xml:space="preserve"/>
+        <w:br/>
+        <w:t xml:space="preserve">Community support is via </w:t>
+      </w:r>
+      <w:r>
+        <w:rPr>
+          <w:rFonts w:ascii="Arial" w:hAnsi="Arial" w:cs="Arial"/>
+          <w:sz w:val="24"/>
+          <w:sz-cs w:val="24"/>
+          <w:b/>
+          <w:spacing w:val="0"/>
+        </w:rPr>
+        <w:t xml:space="preserve">GitHub/Forum</w:t>
+      </w:r>
+      <w:r>
+        <w:rPr>
+          <w:rFonts w:ascii="Arial" w:hAnsi="Arial" w:cs="Arial"/>
+          <w:sz w:val="24"/>
+          <w:sz-cs w:val="24"/>
+          <w:spacing w:val="0"/>
+        </w:rPr>
+        <w:t xml:space="preserve"> (no paid SLA by default).</w:t>
+        <w:br/>
+        <w:t xml:space="preserve">Enterprise/Developer editions provide paid support options.</w:t>
+      </w:r>
+    </w:p>
+    <w:p>
+      <w:pPr>
+        <w:ind w:left="720" w:first-line="-720"/>
+      </w:pPr>
+      <w:r>
+        <w:rPr>
+          <w:rFonts w:ascii="Arial" w:hAnsi="Arial" w:cs="Arial"/>
+          <w:sz w:val="24"/>
+          <w:sz-cs w:val="24"/>
+          <w:b/>
+        </w:rPr>
+        <w:t xml:space="preserve"/>
+        <w:tab/>
+        <w:t xml:space="preserve">4</w:t>
+        <w:tab/>
+        <w:t xml:space="preserve"/>
+      </w:r>
+      <w:r>
+        <w:rPr>
+          <w:rFonts w:ascii="Arial" w:hAnsi="Arial" w:cs="Arial"/>
+          <w:sz w:val="24"/>
+          <w:sz-cs w:val="24"/>
+          <w:b/>
+          <w:spacing w:val="0"/>
+        </w:rPr>
+        <w:t xml:space="preserve">Branding / white-label:</w:t>
+      </w:r>
+      <w:r>
+        <w:rPr>
+          <w:rFonts w:ascii="Arial" w:hAnsi="Arial" w:cs="Arial"/>
+          <w:sz w:val="24"/>
+          <w:sz-cs w:val="24"/>
+          <w:spacing w:val="0"/>
+        </w:rPr>
+        <w:t xml:space="preserve"/>
+        <w:br/>
+        <w:t xml:space="preserve">Community must keep original branding and copyright notices.</w:t>
+        <w:br/>
+        <w:t xml:space="preserve">White-label capabilities are commercial.</w:t>
+      </w:r>
+    </w:p>
+    <w:p>
+      <w:pPr>
+        <w:ind w:left="720" w:first-line="-720"/>
+      </w:pPr>
+      <w:r>
+        <w:rPr>
+          <w:rFonts w:ascii="Arial" w:hAnsi="Arial" w:cs="Arial"/>
+          <w:sz w:val="24"/>
+          <w:sz-cs w:val="24"/>
+          <w:b/>
+        </w:rPr>
+        <w:t xml:space="preserve"/>
+        <w:tab/>
+        <w:t xml:space="preserve">5</w:t>
+        <w:tab/>
+        <w:t xml:space="preserve"/>
+      </w:r>
+      <w:r>
+        <w:rPr>
+          <w:rFonts w:ascii="Arial" w:hAnsi="Arial" w:cs="Arial"/>
+          <w:sz w:val="24"/>
+          <w:sz-cs w:val="24"/>
+          <w:b/>
+          <w:spacing w:val="0"/>
+        </w:rPr>
+        <w:t xml:space="preserve">License constraints for SaaS/proprietary products:</w:t>
+      </w:r>
+      <w:r>
+        <w:rPr>
+          <w:rFonts w:ascii="Arial" w:hAnsi="Arial" w:cs="Arial"/>
+          <w:sz w:val="24"/>
+          <w:sz-cs w:val="24"/>
+          <w:spacing w:val="0"/>
+        </w:rPr>
+        <w:t xml:space="preserve"/>
+        <w:br/>
+        <w:t xml:space="preserve">Community uses AGPL v3; if used/modified in network software distribution, source code obligations apply.</w:t>
+        <w:br/>
+        <w:t xml:space="preserve">Commercial licensing is needed for proprietary closed-source embedding.</w:t>
+      </w:r>
+    </w:p>
+    <w:p>
+      <w:pPr>
+        <w:ind w:left="720" w:first-line="-720"/>
+      </w:pPr>
+      <w:r>
+        <w:rPr>
+          <w:rFonts w:ascii="Arial" w:hAnsi="Arial" w:cs="Arial"/>
+          <w:sz w:val="24"/>
+          <w:sz-cs w:val="24"/>
+          <w:b/>
+        </w:rPr>
+        <w:t xml:space="preserve"/>
+        <w:tab/>
+        <w:t xml:space="preserve">6</w:t>
+        <w:tab/>
+        <w:t xml:space="preserve"/>
+      </w:r>
+      <w:r>
+        <w:rPr>
+          <w:rFonts w:ascii="Arial" w:hAnsi="Arial" w:cs="Arial"/>
+          <w:sz w:val="24"/>
+          <w:sz-cs w:val="24"/>
+          <w:b/>
+          <w:spacing w:val="0"/>
+        </w:rPr>
+        <w:t xml:space="preserve">Scale and enterprise controls:</w:t>
+      </w:r>
+      <w:r>
+        <w:rPr>
+          <w:rFonts w:ascii="Arial" w:hAnsi="Arial" w:cs="Arial"/>
+          <w:sz w:val="24"/>
+          <w:sz-cs w:val="24"/>
+          <w:spacing w:val="0"/>
+        </w:rPr>
+        <w:t xml:space="preserve"/>
+        <w:br/>
+        <w:t xml:space="preserve">Community FAQ explicitly notes no clustering/enterprise scalability and fewer enterprise admin/security features compared to paid editions.</w:t>
+      </w:r>
+    </w:p>
+    <w:p>
+      <w:pPr>
+        <w:ind w:left="720" w:first-line="-720"/>
+      </w:pPr>
+      <w:r>
+        <w:rPr>
+          <w:rFonts w:ascii="Arial" w:hAnsi="Arial" w:cs="Arial"/>
+          <w:sz w:val="24"/>
+          <w:sz-cs w:val="24"/>
+          <w:b/>
+        </w:rPr>
+        <w:t xml:space="preserve"/>
+        <w:tab/>
+        <w:t xml:space="preserve">7</w:t>
+        <w:tab/>
+        <w:t xml:space="preserve"/>
+      </w:r>
+      <w:r>
+        <w:rPr>
+          <w:rFonts w:ascii="Arial" w:hAnsi="Arial" w:cs="Arial"/>
+          <w:sz w:val="24"/>
+          <w:sz-cs w:val="24"/>
+          <w:b/>
+          <w:spacing w:val="0"/>
+        </w:rPr>
+        <w:t xml:space="preserve">Mobile web editors and enterprise extras:</w:t>
+      </w:r>
+      <w:r>
+        <w:rPr>
+          <w:rFonts w:ascii="Arial" w:hAnsi="Arial" w:cs="Arial"/>
+          <w:sz w:val="24"/>
+          <w:sz-cs w:val="24"/>
+          <w:spacing w:val="0"/>
+        </w:rPr>
+        <w:t xml:space="preserve"/>
+        <w:br/>
+        <w:t xml:space="preserve">Enterprise FAQ states mobile web editors and some enterprise-level options are part of paid tiers, not Community baseline.</w:t>
       </w:r>
     </w:p>
     <w:p>
@@ -1366,149 +1539,207 @@
           <w:spacing w:val="0"/>
           <w:color w:val="0E2140"/>
         </w:rPr>
-        <w:t xml:space="preserve">7. Known Gaps and Honest Limits</w:t>
-      </w:r>
-    </w:p>
-    <w:p>
-      <w:pPr>
-        <w:ind w:left="720" w:first-line="-720"/>
-      </w:pPr>
-      <w:r>
-        <w:rPr>
-          <w:rFonts w:ascii="Arial" w:hAnsi="Arial" w:cs="Arial"/>
-          <w:sz w:val="24"/>
-          <w:sz-cs w:val="24"/>
-        </w:rPr>
-        <w:t xml:space="preserve"/>
-        <w:tab/>
-        <w:t xml:space="preserve">•</w:t>
-        <w:tab/>
-        <w:t xml:space="preserve"/>
-      </w:r>
-      <w:r>
-        <w:rPr>
-          <w:rFonts w:ascii="Arial" w:hAnsi="Arial" w:cs="Arial"/>
-          <w:sz w:val="24"/>
-          <w:sz-cs w:val="24"/>
-          <w:spacing w:val="0"/>
-        </w:rPr>
-        <w:t xml:space="preserve">This is a </w:t>
-      </w:r>
-      <w:r>
-        <w:rPr>
-          <w:rFonts w:ascii="Arial" w:hAnsi="Arial" w:cs="Arial"/>
-          <w:sz w:val="24"/>
-          <w:sz-cs w:val="24"/>
-          <w:b/>
-          <w:spacing w:val="0"/>
-        </w:rPr>
-        <w:t xml:space="preserve">single-host v1 architecture</w:t>
-      </w:r>
-      <w:r>
-        <w:rPr>
-          <w:rFonts w:ascii="Arial" w:hAnsi="Arial" w:cs="Arial"/>
-          <w:sz w:val="24"/>
-          <w:sz-cs w:val="24"/>
-          <w:spacing w:val="0"/>
-        </w:rPr>
-        <w:t xml:space="preserve">; high-availability clustering is not part of the baseline.</w:t>
-      </w:r>
-    </w:p>
-    <w:p>
-      <w:pPr>
-        <w:ind w:left="720" w:first-line="-720"/>
-      </w:pPr>
-      <w:r>
-        <w:rPr>
-          <w:rFonts w:ascii="Arial" w:hAnsi="Arial" w:cs="Arial"/>
-          <w:sz w:val="24"/>
-          <w:sz-cs w:val="24"/>
-        </w:rPr>
-        <w:t xml:space="preserve"/>
-        <w:tab/>
-        <w:t xml:space="preserve">•</w:t>
-        <w:tab/>
-        <w:t xml:space="preserve"/>
-      </w:r>
-      <w:r>
-        <w:rPr>
-          <w:rFonts w:ascii="Arial" w:hAnsi="Arial" w:cs="Arial"/>
-          <w:sz w:val="24"/>
-          <w:sz-cs w:val="24"/>
-          <w:spacing w:val="0"/>
-        </w:rPr>
-        <w:t xml:space="preserve">Community solution has </w:t>
-      </w:r>
-      <w:r>
-        <w:rPr>
-          <w:rFonts w:ascii="Arial" w:hAnsi="Arial" w:cs="Arial"/>
-          <w:sz w:val="24"/>
-          <w:sz-cs w:val="24"/>
-          <w:b/>
-          <w:spacing w:val="0"/>
-        </w:rPr>
-        <w:t xml:space="preserve">no official enterprise SLA</w:t>
-      </w:r>
-      <w:r>
-        <w:rPr>
-          <w:rFonts w:ascii="Arial" w:hAnsi="Arial" w:cs="Arial"/>
-          <w:sz w:val="24"/>
-          <w:sz-cs w:val="24"/>
-          <w:spacing w:val="0"/>
-        </w:rPr>
-        <w:t xml:space="preserve">.</w:t>
-      </w:r>
-    </w:p>
-    <w:p>
-      <w:pPr>
-        <w:ind w:left="720" w:first-line="-720"/>
-      </w:pPr>
-      <w:r>
-        <w:rPr>
-          <w:rFonts w:ascii="Arial" w:hAnsi="Arial" w:cs="Arial"/>
-          <w:sz w:val="24"/>
-          <w:sz-cs w:val="24"/>
-        </w:rPr>
-        <w:t xml:space="preserve"/>
-        <w:tab/>
-        <w:t xml:space="preserve">•</w:t>
-        <w:tab/>
-        <w:t xml:space="preserve"/>
-      </w:r>
-      <w:r>
-        <w:rPr>
-          <w:rFonts w:ascii="Arial" w:hAnsi="Arial" w:cs="Arial"/>
-          <w:sz w:val="24"/>
-          <w:sz-cs w:val="24"/>
-          <w:spacing w:val="0"/>
-        </w:rPr>
-        <w:t xml:space="preserve">Some features in paid enterprise bundles (depending on product edition/license terms) are outside this free implementation.</w:t>
-      </w:r>
-    </w:p>
-    <w:p>
-      <w:pPr>
-        <w:ind w:left="720" w:first-line="-720"/>
-      </w:pPr>
-      <w:r>
-        <w:rPr>
-          <w:rFonts w:ascii="Arial" w:hAnsi="Arial" w:cs="Arial"/>
-          <w:sz w:val="24"/>
-          <w:sz-cs w:val="24"/>
-        </w:rPr>
-        <w:t xml:space="preserve"/>
-        <w:tab/>
-        <w:t xml:space="preserve">•</w:t>
-        <w:tab/>
-        <w:t xml:space="preserve"/>
-      </w:r>
-      <w:r>
-        <w:rPr>
-          <w:rFonts w:ascii="Arial" w:hAnsi="Arial" w:cs="Arial"/>
-          <w:sz w:val="24"/>
-          <w:sz-cs w:val="24"/>
-          <w:spacing w:val="0"/>
-        </w:rPr>
-        <w:t xml:space="preserve">Without centralized PKI/MDM/AD policy, certificate trust rollout in HTTPS local-lab mode requires extra client-side work.</w:t>
+        <w:t xml:space="preserve">7. Implementation Highlights in This Project</w:t>
+      </w:r>
+    </w:p>
+    <w:p>
+      <w:pPr>
+        <w:ind w:left="720" w:first-line="-720"/>
+      </w:pPr>
+      <w:r>
+        <w:rPr>
+          <w:rFonts w:ascii="Arial" w:hAnsi="Arial" w:cs="Arial"/>
+          <w:sz w:val="24"/>
+          <w:sz-cs w:val="24"/>
+          <w:b/>
+        </w:rPr>
+        <w:t xml:space="preserve"/>
+        <w:tab/>
+        <w:t xml:space="preserve">•</w:t>
+        <w:tab/>
+        <w:t xml:space="preserve"/>
+      </w:r>
+      <w:r>
+        <w:rPr>
+          <w:rFonts w:ascii="Arial" w:hAnsi="Arial" w:cs="Arial"/>
+          <w:sz w:val="24"/>
+          <w:sz-cs w:val="24"/>
+          <w:b/>
+          <w:spacing w:val="0"/>
+        </w:rPr>
+        <w:t xml:space="preserve">Two runtime modes:</w:t>
+      </w:r>
+      <w:r>
+        <w:rPr>
+          <w:rFonts w:ascii="Arial" w:hAnsi="Arial" w:cs="Arial"/>
+          <w:sz w:val="24"/>
+          <w:sz-cs w:val="24"/>
+          <w:spacing w:val="0"/>
+        </w:rPr>
+        <w:t xml:space="preserve"/>
+      </w:r>
+    </w:p>
+    <w:p>
+      <w:pPr>
+        <w:ind w:left="1440" w:first-line="-1440"/>
+      </w:pPr>
+      <w:r>
+        <w:rPr>
+          <w:rFonts w:ascii="Arial" w:hAnsi="Arial" w:cs="Arial"/>
+          <w:sz w:val="24"/>
+          <w:sz-cs w:val="24"/>
+        </w:rPr>
+        <w:t xml:space="preserve"/>
+        <w:tab/>
+        <w:t xml:space="preserve">◦</w:t>
+        <w:tab/>
+        <w:t xml:space="preserve"/>
+      </w:r>
+      <w:r>
+        <w:rPr>
+          <w:rFonts w:ascii="Arial" w:hAnsi="Arial" w:cs="Arial"/>
+          <w:sz w:val="24"/>
+          <w:sz-cs w:val="24"/>
+          <w:spacing w:val="0"/>
+        </w:rPr>
+        <w:t xml:space="preserve">HTTP over IP + ports (default for simple LAN demonstration)</w:t>
+      </w:r>
+    </w:p>
+    <w:p>
+      <w:pPr>
+        <w:ind w:left="1440" w:first-line="-1440"/>
+      </w:pPr>
+      <w:r>
+        <w:rPr>
+          <w:rFonts w:ascii="Arial" w:hAnsi="Arial" w:cs="Arial"/>
+          <w:sz w:val="24"/>
+          <w:sz-cs w:val="24"/>
+        </w:rPr>
+        <w:t xml:space="preserve"/>
+        <w:tab/>
+        <w:t xml:space="preserve">◦</w:t>
+        <w:tab/>
+        <w:t xml:space="preserve"/>
+      </w:r>
+      <w:r>
+        <w:rPr>
+          <w:rFonts w:ascii="Arial" w:hAnsi="Arial" w:cs="Arial"/>
+          <w:sz w:val="24"/>
+          <w:sz-cs w:val="24"/>
+          <w:spacing w:val="0"/>
+        </w:rPr>
+        <w:t xml:space="preserve">HTTPS/domain mode (optional, with Caddy)</w:t>
+      </w:r>
+    </w:p>
+    <w:p>
+      <w:pPr>
+        <w:ind w:left="720" w:first-line="-720"/>
+      </w:pPr>
+      <w:r>
+        <w:rPr>
+          <w:rFonts w:ascii="Arial" w:hAnsi="Arial" w:cs="Arial"/>
+          <w:sz w:val="24"/>
+          <w:sz-cs w:val="24"/>
+          <w:b/>
+        </w:rPr>
+        <w:t xml:space="preserve"/>
+        <w:tab/>
+        <w:t xml:space="preserve">•</w:t>
+        <w:tab/>
+        <w:t xml:space="preserve"/>
+      </w:r>
+      <w:r>
+        <w:rPr>
+          <w:rFonts w:ascii="Arial" w:hAnsi="Arial" w:cs="Arial"/>
+          <w:sz w:val="24"/>
+          <w:sz-cs w:val="24"/>
+          <w:b/>
+          <w:spacing w:val="0"/>
+        </w:rPr>
+        <w:t xml:space="preserve">No-black-box configuration:</w:t>
+      </w:r>
+      <w:r>
+        <w:rPr>
+          <w:rFonts w:ascii="Arial" w:hAnsi="Arial" w:cs="Arial"/>
+          <w:sz w:val="24"/>
+          <w:sz-cs w:val="24"/>
+          <w:spacing w:val="0"/>
+        </w:rPr>
+        <w:t xml:space="preserve"> integration is scripted and reproducible, not manual container edits.</w:t>
+      </w:r>
+    </w:p>
+    <w:p>
+      <w:pPr>
+        <w:ind w:left="720" w:first-line="-720"/>
+      </w:pPr>
+      <w:r>
+        <w:rPr>
+          <w:rFonts w:ascii="Arial" w:hAnsi="Arial" w:cs="Arial"/>
+          <w:sz w:val="24"/>
+          <w:sz-cs w:val="24"/>
+          <w:b/>
+        </w:rPr>
+        <w:t xml:space="preserve"/>
+        <w:tab/>
+        <w:t xml:space="preserve">•</w:t>
+        <w:tab/>
+        <w:t xml:space="preserve"/>
+      </w:r>
+      <w:r>
+        <w:rPr>
+          <w:rFonts w:ascii="Arial" w:hAnsi="Arial" w:cs="Arial"/>
+          <w:sz w:val="24"/>
+          <w:sz-cs w:val="24"/>
+          <w:b/>
+          <w:spacing w:val="0"/>
+        </w:rPr>
+        <w:t xml:space="preserve">Robustness controls:</w:t>
+      </w:r>
+      <w:r>
+        <w:rPr>
+          <w:rFonts w:ascii="Arial" w:hAnsi="Arial" w:cs="Arial"/>
+          <w:sz w:val="24"/>
+          <w:sz-cs w:val="24"/>
+          <w:spacing w:val="0"/>
+        </w:rPr>
+        <w:t xml:space="preserve"> resource limits, log rotation, health checks.</w:t>
+      </w:r>
+    </w:p>
+    <w:p>
+      <w:pPr>
+        <w:ind w:left="720" w:first-line="-720"/>
+      </w:pPr>
+      <w:r>
+        <w:rPr>
+          <w:rFonts w:ascii="Arial" w:hAnsi="Arial" w:cs="Arial"/>
+          <w:sz w:val="24"/>
+          <w:sz-cs w:val="24"/>
+          <w:b/>
+        </w:rPr>
+        <w:t xml:space="preserve"/>
+        <w:tab/>
+        <w:t xml:space="preserve">•</w:t>
+        <w:tab/>
+        <w:t xml:space="preserve"/>
+      </w:r>
+      <w:r>
+        <w:rPr>
+          <w:rFonts w:ascii="Arial" w:hAnsi="Arial" w:cs="Arial"/>
+          <w:sz w:val="24"/>
+          <w:sz-cs w:val="24"/>
+          <w:b/>
+          <w:spacing w:val="0"/>
+        </w:rPr>
+        <w:t xml:space="preserve">Recovery controls:</w:t>
+      </w:r>
+      <w:r>
+        <w:rPr>
+          <w:rFonts w:ascii="Arial" w:hAnsi="Arial" w:cs="Arial"/>
+          <w:sz w:val="24"/>
+          <w:sz-cs w:val="24"/>
+          <w:spacing w:val="0"/>
+        </w:rPr>
+        <w:t xml:space="preserve"> backup and restore scripts included.</w:t>
       </w:r>
     </w:p>
     <w:p>
@@ -1524,79 +1755,149 @@
           <w:spacing w:val="0"/>
           <w:color w:val="0E2140"/>
         </w:rPr>
-        <w:t xml:space="preserve">8. Cost and Value Conclusion</w:t>
-      </w:r>
-    </w:p>
-    <w:p>
-      <w:pPr>
-        <w:spacing w:after="240"/>
-      </w:pPr>
-      <w:r>
-        <w:rPr>
-          <w:rFonts w:ascii="Arial" w:hAnsi="Arial" w:cs="Arial"/>
-          <w:sz w:val="24"/>
-          <w:sz-cs w:val="24"/>
-          <w:b/>
-          <w:spacing w:val="0"/>
-        </w:rPr>
-        <w:t xml:space="preserve">License Cost:</w:t>
-      </w:r>
-      <w:r>
-        <w:rPr>
-          <w:rFonts w:ascii="Arial" w:hAnsi="Arial" w:cs="Arial"/>
-          <w:sz w:val="24"/>
-          <w:sz-cs w:val="24"/>
-          <w:spacing w:val="0"/>
-        </w:rPr>
-        <w:t xml:space="preserve"> 0 (community/open-source components)</w:t>
-      </w:r>
-    </w:p>
-    <w:p>
-      <w:pPr>
-        <w:spacing w:after="240"/>
-      </w:pPr>
-      <w:r>
-        <w:rPr>
-          <w:rFonts w:ascii="Arial" w:hAnsi="Arial" w:cs="Arial"/>
-          <w:sz w:val="24"/>
-          <w:sz-cs w:val="24"/>
-          <w:b/>
-          <w:spacing w:val="0"/>
-        </w:rPr>
-        <w:t xml:space="preserve">Operational Cost:</w:t>
-      </w:r>
-      <w:r>
-        <w:rPr>
-          <w:rFonts w:ascii="Arial" w:hAnsi="Arial" w:cs="Arial"/>
-          <w:sz w:val="24"/>
-          <w:sz-cs w:val="24"/>
-          <w:spacing w:val="0"/>
-        </w:rPr>
-        <w:t xml:space="preserve"> VM resources + administrator time</w:t>
-      </w:r>
-    </w:p>
-    <w:p>
-      <w:pPr>
-        <w:spacing w:after="240"/>
-      </w:pPr>
-      <w:r>
-        <w:rPr>
-          <w:rFonts w:ascii="Arial" w:hAnsi="Arial" w:cs="Arial"/>
-          <w:sz w:val="24"/>
-          <w:sz-cs w:val="24"/>
-          <w:b/>
-          <w:spacing w:val="0"/>
-        </w:rPr>
-        <w:t xml:space="preserve">Conclusion:</w:t>
-      </w:r>
-      <w:r>
-        <w:rPr>
-          <w:rFonts w:ascii="Arial" w:hAnsi="Arial" w:cs="Arial"/>
-          <w:sz w:val="24"/>
-          <w:sz-cs w:val="24"/>
-          <w:spacing w:val="0"/>
-        </w:rPr>
-        <w:t xml:space="preserve"> This project achieves a highly complete, practical, and free self-hosted office collaboration platform. It does not claim to be 100% identical to every enterprise paid feature, but it reaches the strongest feasible parity for a no-license-cost solution and is suitable for learning, demos, and small-to-medium self-hosted deployments.</w:t>
+        <w:t xml:space="preserve">8. Known Gaps and Honest Limits</w:t>
+      </w:r>
+    </w:p>
+    <w:p>
+      <w:pPr>
+        <w:ind w:left="720" w:first-line="-720"/>
+      </w:pPr>
+      <w:r>
+        <w:rPr>
+          <w:rFonts w:ascii="Arial" w:hAnsi="Arial" w:cs="Arial"/>
+          <w:sz w:val="24"/>
+          <w:sz-cs w:val="24"/>
+        </w:rPr>
+        <w:t xml:space="preserve"/>
+        <w:tab/>
+        <w:t xml:space="preserve">•</w:t>
+        <w:tab/>
+        <w:t xml:space="preserve"/>
+      </w:r>
+      <w:r>
+        <w:rPr>
+          <w:rFonts w:ascii="Arial" w:hAnsi="Arial" w:cs="Arial"/>
+          <w:sz w:val="24"/>
+          <w:sz-cs w:val="24"/>
+          <w:spacing w:val="0"/>
+        </w:rPr>
+        <w:t xml:space="preserve">This is a </w:t>
+      </w:r>
+      <w:r>
+        <w:rPr>
+          <w:rFonts w:ascii="Arial" w:hAnsi="Arial" w:cs="Arial"/>
+          <w:sz w:val="24"/>
+          <w:sz-cs w:val="24"/>
+          <w:b/>
+          <w:spacing w:val="0"/>
+        </w:rPr>
+        <w:t xml:space="preserve">single-host v1 architecture</w:t>
+      </w:r>
+      <w:r>
+        <w:rPr>
+          <w:rFonts w:ascii="Arial" w:hAnsi="Arial" w:cs="Arial"/>
+          <w:sz w:val="24"/>
+          <w:sz-cs w:val="24"/>
+          <w:spacing w:val="0"/>
+        </w:rPr>
+        <w:t xml:space="preserve">; high-availability clustering is not part of the baseline.</w:t>
+      </w:r>
+    </w:p>
+    <w:p>
+      <w:pPr>
+        <w:ind w:left="720" w:first-line="-720"/>
+      </w:pPr>
+      <w:r>
+        <w:rPr>
+          <w:rFonts w:ascii="Arial" w:hAnsi="Arial" w:cs="Arial"/>
+          <w:sz w:val="24"/>
+          <w:sz-cs w:val="24"/>
+        </w:rPr>
+        <w:t xml:space="preserve"/>
+        <w:tab/>
+        <w:t xml:space="preserve">•</w:t>
+        <w:tab/>
+        <w:t xml:space="preserve"/>
+      </w:r>
+      <w:r>
+        <w:rPr>
+          <w:rFonts w:ascii="Arial" w:hAnsi="Arial" w:cs="Arial"/>
+          <w:sz w:val="24"/>
+          <w:sz-cs w:val="24"/>
+          <w:spacing w:val="0"/>
+        </w:rPr>
+        <w:t xml:space="preserve">Community solution has </w:t>
+      </w:r>
+      <w:r>
+        <w:rPr>
+          <w:rFonts w:ascii="Arial" w:hAnsi="Arial" w:cs="Arial"/>
+          <w:sz w:val="24"/>
+          <w:sz-cs w:val="24"/>
+          <w:b/>
+          <w:spacing w:val="0"/>
+        </w:rPr>
+        <w:t xml:space="preserve">no official enterprise SLA</w:t>
+      </w:r>
+      <w:r>
+        <w:rPr>
+          <w:rFonts w:ascii="Arial" w:hAnsi="Arial" w:cs="Arial"/>
+          <w:sz w:val="24"/>
+          <w:sz-cs w:val="24"/>
+          <w:spacing w:val="0"/>
+        </w:rPr>
+        <w:t xml:space="preserve">.</w:t>
+      </w:r>
+    </w:p>
+    <w:p>
+      <w:pPr>
+        <w:ind w:left="720" w:first-line="-720"/>
+      </w:pPr>
+      <w:r>
+        <w:rPr>
+          <w:rFonts w:ascii="Arial" w:hAnsi="Arial" w:cs="Arial"/>
+          <w:sz w:val="24"/>
+          <w:sz-cs w:val="24"/>
+        </w:rPr>
+        <w:t xml:space="preserve"/>
+        <w:tab/>
+        <w:t xml:space="preserve">•</w:t>
+        <w:tab/>
+        <w:t xml:space="preserve"/>
+      </w:r>
+      <w:r>
+        <w:rPr>
+          <w:rFonts w:ascii="Arial" w:hAnsi="Arial" w:cs="Arial"/>
+          <w:sz w:val="24"/>
+          <w:sz-cs w:val="24"/>
+          <w:spacing w:val="0"/>
+        </w:rPr>
+        <w:t xml:space="preserve">Some features in paid enterprise bundles (depending on product edition/license terms) are outside this free implementation.</w:t>
+      </w:r>
+    </w:p>
+    <w:p>
+      <w:pPr>
+        <w:ind w:left="720" w:first-line="-720"/>
+      </w:pPr>
+      <w:r>
+        <w:rPr>
+          <w:rFonts w:ascii="Arial" w:hAnsi="Arial" w:cs="Arial"/>
+          <w:sz w:val="24"/>
+          <w:sz-cs w:val="24"/>
+        </w:rPr>
+        <w:t xml:space="preserve"/>
+        <w:tab/>
+        <w:t xml:space="preserve">•</w:t>
+        <w:tab/>
+        <w:t xml:space="preserve"/>
+      </w:r>
+      <w:r>
+        <w:rPr>
+          <w:rFonts w:ascii="Arial" w:hAnsi="Arial" w:cs="Arial"/>
+          <w:sz w:val="24"/>
+          <w:sz-cs w:val="24"/>
+          <w:spacing w:val="0"/>
+        </w:rPr>
+        <w:t xml:space="preserve">Without centralized PKI/MDM/AD policy, certificate trust rollout in HTTPS local-lab mode requires extra client-side work.</w:t>
       </w:r>
     </w:p>
     <w:p>
@@ -1612,7 +1913,95 @@
           <w:spacing w:val="0"/>
           <w:color w:val="0E2140"/>
         </w:rPr>
-        <w:t xml:space="preserve">9. Next-Phase Improvements (Optional)</w:t>
+        <w:t xml:space="preserve">9. Cost and Value Conclusion</w:t>
+      </w:r>
+    </w:p>
+    <w:p>
+      <w:pPr>
+        <w:spacing w:after="240"/>
+      </w:pPr>
+      <w:r>
+        <w:rPr>
+          <w:rFonts w:ascii="Arial" w:hAnsi="Arial" w:cs="Arial"/>
+          <w:sz w:val="24"/>
+          <w:sz-cs w:val="24"/>
+          <w:b/>
+          <w:spacing w:val="0"/>
+        </w:rPr>
+        <w:t xml:space="preserve">License Cost:</w:t>
+      </w:r>
+      <w:r>
+        <w:rPr>
+          <w:rFonts w:ascii="Arial" w:hAnsi="Arial" w:cs="Arial"/>
+          <w:sz w:val="24"/>
+          <w:sz-cs w:val="24"/>
+          <w:spacing w:val="0"/>
+        </w:rPr>
+        <w:t xml:space="preserve"> 0 (community/open-source components)</w:t>
+      </w:r>
+    </w:p>
+    <w:p>
+      <w:pPr>
+        <w:spacing w:after="240"/>
+      </w:pPr>
+      <w:r>
+        <w:rPr>
+          <w:rFonts w:ascii="Arial" w:hAnsi="Arial" w:cs="Arial"/>
+          <w:sz w:val="24"/>
+          <w:sz-cs w:val="24"/>
+          <w:b/>
+          <w:spacing w:val="0"/>
+        </w:rPr>
+        <w:t xml:space="preserve">Operational Cost:</w:t>
+      </w:r>
+      <w:r>
+        <w:rPr>
+          <w:rFonts w:ascii="Arial" w:hAnsi="Arial" w:cs="Arial"/>
+          <w:sz w:val="24"/>
+          <w:sz-cs w:val="24"/>
+          <w:spacing w:val="0"/>
+        </w:rPr>
+        <w:t xml:space="preserve"> VM resources + administrator time</w:t>
+      </w:r>
+    </w:p>
+    <w:p>
+      <w:pPr>
+        <w:spacing w:after="240"/>
+      </w:pPr>
+      <w:r>
+        <w:rPr>
+          <w:rFonts w:ascii="Arial" w:hAnsi="Arial" w:cs="Arial"/>
+          <w:sz w:val="24"/>
+          <w:sz-cs w:val="24"/>
+          <w:b/>
+          <w:spacing w:val="0"/>
+        </w:rPr>
+        <w:t xml:space="preserve">Conclusion:</w:t>
+      </w:r>
+      <w:r>
+        <w:rPr>
+          <w:rFonts w:ascii="Arial" w:hAnsi="Arial" w:cs="Arial"/>
+          <w:sz w:val="24"/>
+          <w:sz-cs w:val="24"/>
+          <w:spacing w:val="0"/>
+        </w:rPr>
+        <w:t xml:space="preserve"> This project achieves a highly complete, practical, and free self-hosted office collaboration platform. It does not claim to be 100% identical to every enterprise paid feature, but it reaches the strongest feasible parity for a no-license-cost solution and is suitable for learning, demos, and small-to-medium self-hosted deployments.</w:t>
+      </w:r>
+    </w:p>
+    <w:p>
+      <w:pPr>
+        <w:spacing w:after="298"/>
+      </w:pPr>
+      <w:r>
+        <w:rPr>
+          <w:rFonts w:ascii="Arial" w:hAnsi="Arial" w:cs="Arial"/>
+          <w:sz w:val="36"/>
+          <w:sz-cs w:val="36"/>
+          <w:b/>
+          <w:spacing w:val="0"/>
+          <w:color w:val="0E2140"/>
+        </w:rPr>
+        <w:t xml:space="preserve">10. Next-Phase Improvements (Optional)</w:t>
       </w:r>
     </w:p>
     <w:p>
@@ -1758,6 +2147,32 @@
           <w:color w:val="343434"/>
         </w:rPr>
         <w:t xml:space="preserve">This report documents the engineering decision process and the implemented replacement architecture, not a legal licensing statement. Final feature/legal scope must always be confirmed against current official product licensing terms.</w:t>
+      </w:r>
+    </w:p>
+    <w:p>
+      <w:pPr>
+        <w:spacing w:after="240"/>
+      </w:pPr>
+      <w:r>
+        <w:rPr>
+          <w:rFonts w:ascii="Arial" w:hAnsi="Arial" w:cs="Arial"/>
+          <w:sz w:val="24"/>
+          <w:sz-cs w:val="24"/>
+          <w:b/>
+          <w:spacing w:val="0"/>
+          <w:color w:val="343434"/>
+        </w:rPr>
+        <w:t xml:space="preserve">Reference notes (official ONLYOFFICE pages):</w:t>
+      </w:r>
+      <w:r>
+        <w:rPr>
+          <w:rFonts w:ascii="Arial" w:hAnsi="Arial" w:cs="Arial"/>
+          <w:sz w:val="24"/>
+          <w:sz-cs w:val="24"/>
+          <w:spacing w:val="0"/>
+          <w:color w:val="343434"/>
+        </w:rPr>
+        <w:t xml:space="preserve"> Docs Community Edition Licensing FAQ, ONLYOFFICE Docs editions comparison page, and Docs Enterprise FAQ.</w:t>
       </w:r>
     </w:p>
     <w:sectPr/>

</xml_diff>